<commit_message>
📄 : – refresh generated resume artifacts
</commit_message>
<xml_diff>
--- a/public/docs/resume/2026-10/resume.docx
+++ b/public/docs/resume/2026-10/resume.docx
@@ -141,6 +141,12 @@
           <w:b/>
         </w:rPr>
         <w:t xml:space="preserve">Muon Space</w:t>
+      </w:r>
+      <w:r>
+        <w:t xml:space="preserve"> </w:t>
+      </w:r>
+      <w:r>
+        <w:t xml:space="preserve">San Jose, CA</w:t>
       </w:r>
       <w:r>
         <w:br/>

</xml_diff>